<commit_message>
Final update before submission
</commit_message>
<xml_diff>
--- a/HDS_MM_HannaHong_2602_Cover.docx
+++ b/HDS_MM_HannaHong_2602_Cover.docx
@@ -16,7 +16,7 @@
           <w:noProof/>
         </w:rPr>
         <w:drawing>
-          <wp:inline distT="0" distB="0" distL="0" distR="0" wp14:anchorId="0425935D" wp14:editId="20A29B98">
+          <wp:inline distT="0" distB="0" distL="0" distR="0" wp14:anchorId="0425935D" wp14:editId="49013001">
             <wp:extent cx="2667000" cy="1085317"/>
             <wp:effectExtent l="0" t="0" r="0" b="635"/>
             <wp:docPr id="3" name="Picture 3"/>
@@ -427,7 +427,13 @@
               <w:rPr>
                 <w:rFonts w:asciiTheme="minorHAnsi" w:hAnsiTheme="minorHAnsi" w:cstheme="minorHAnsi"/>
               </w:rPr>
-              <w:t>8671</w:t>
+              <w:t>86</w:t>
+            </w:r>
+            <w:r>
+              <w:rPr>
+                <w:rFonts w:asciiTheme="minorHAnsi" w:hAnsiTheme="minorHAnsi" w:cstheme="minorHAnsi"/>
+              </w:rPr>
+              <w:t>98</w:t>
             </w:r>
           </w:p>
         </w:tc>
@@ -482,7 +488,13 @@
               <w:rPr>
                 <w:rFonts w:asciiTheme="minorHAnsi" w:hAnsiTheme="minorHAnsi" w:cstheme="minorHAnsi"/>
               </w:rPr>
-              <w:t>846</w:t>
+              <w:t>8</w:t>
+            </w:r>
+            <w:r>
+              <w:rPr>
+                <w:rFonts w:asciiTheme="minorHAnsi" w:hAnsiTheme="minorHAnsi" w:cstheme="minorHAnsi"/>
+              </w:rPr>
+              <w:t>74</w:t>
             </w:r>
           </w:p>
         </w:tc>
@@ -3653,6 +3665,27 @@
 </file>
 
 <file path=customXml/item1.xml><?xml version="1.0" encoding="utf-8"?>
+<?mso-contentType ?>
+<FormTemplates xmlns="http://schemas.microsoft.com/sharepoint/v3/contenttype/forms">
+  <Display>DocumentLibraryForm</Display>
+  <Edit>DocumentLibraryForm</Edit>
+  <New>DocumentLibraryForm</New>
+</FormTemplates>
+</file>
+
+<file path=customXml/item2.xml><?xml version="1.0" encoding="utf-8"?>
+<p:properties xmlns:p="http://schemas.microsoft.com/office/2006/metadata/properties" xmlns:xsi="http://www.w3.org/2001/XMLSchema-instance" xmlns:pc="http://schemas.microsoft.com/office/infopath/2007/PartnerControls">
+  <documentManagement>
+    <TaxCatchAll xmlns="b34db95d-295c-47a3-aa90-4a99ea15312e" xsi:nil="true"/>
+    <lcf76f155ced4ddcb4097134ff3c332f xmlns="d9bf6276-5224-4538-aa70-e59fb8bd1d46">
+      <Terms xmlns="http://schemas.microsoft.com/office/infopath/2007/PartnerControls"/>
+    </lcf76f155ced4ddcb4097134ff3c332f>
+    <MediaLengthInSeconds xmlns="d9bf6276-5224-4538-aa70-e59fb8bd1d46" xsi:nil="true"/>
+  </documentManagement>
+</p:properties>
+</file>
+
+<file path=customXml/item3.xml><?xml version="1.0" encoding="utf-8"?>
 <ct:contentTypeSchema xmlns:ct="http://schemas.microsoft.com/office/2006/metadata/contentType" xmlns:ma="http://schemas.microsoft.com/office/2006/metadata/properties/metaAttributes" ct:_="" ma:_="" ma:contentTypeName="Document" ma:contentTypeID="0x01010028CFBA0B55129D49BC1916AEFB265A0B" ma:contentTypeVersion="19" ma:contentTypeDescription="Create a new document." ma:contentTypeScope="" ma:versionID="75dc258c051fc6e8cd4d068848b5a027">
   <xsd:schema xmlns:xsd="http://www.w3.org/2001/XMLSchema" xmlns:xs="http://www.w3.org/2001/XMLSchema" xmlns:p="http://schemas.microsoft.com/office/2006/metadata/properties" xmlns:ns2="d9bf6276-5224-4538-aa70-e59fb8bd1d46" xmlns:ns3="b34db95d-295c-47a3-aa90-4a99ea15312e" targetNamespace="http://schemas.microsoft.com/office/2006/metadata/properties" ma:root="true" ma:fieldsID="484a849c597c7c178fe4866bbceedaa1" ns2:_="" ns3:_="">
     <xsd:import namespace="d9bf6276-5224-4538-aa70-e59fb8bd1d46"/>
@@ -3907,28 +3940,26 @@
 </ct:contentTypeSchema>
 </file>
 
-<file path=customXml/item2.xml><?xml version="1.0" encoding="utf-8"?>
-<p:properties xmlns:p="http://schemas.microsoft.com/office/2006/metadata/properties" xmlns:xsi="http://www.w3.org/2001/XMLSchema-instance" xmlns:pc="http://schemas.microsoft.com/office/infopath/2007/PartnerControls">
-  <documentManagement>
-    <TaxCatchAll xmlns="b34db95d-295c-47a3-aa90-4a99ea15312e" xsi:nil="true"/>
-    <lcf76f155ced4ddcb4097134ff3c332f xmlns="d9bf6276-5224-4538-aa70-e59fb8bd1d46">
-      <Terms xmlns="http://schemas.microsoft.com/office/infopath/2007/PartnerControls"/>
-    </lcf76f155ced4ddcb4097134ff3c332f>
-    <MediaLengthInSeconds xmlns="d9bf6276-5224-4538-aa70-e59fb8bd1d46" xsi:nil="true"/>
-  </documentManagement>
-</p:properties>
+<file path=customXml/itemProps1.xml><?xml version="1.0" encoding="utf-8"?>
+<ds:datastoreItem xmlns:ds="http://schemas.openxmlformats.org/officeDocument/2006/customXml" ds:itemID="{0E8014CC-8330-4B76-BB01-5261046B1A55}">
+  <ds:schemaRefs>
+    <ds:schemaRef ds:uri="http://schemas.microsoft.com/sharepoint/v3/contenttype/forms"/>
+  </ds:schemaRefs>
+</ds:datastoreItem>
 </file>
 
-<file path=customXml/item3.xml><?xml version="1.0" encoding="utf-8"?>
-<?mso-contentType ?>
-<FormTemplates xmlns="http://schemas.microsoft.com/sharepoint/v3/contenttype/forms">
-  <Display>DocumentLibraryForm</Display>
-  <Edit>DocumentLibraryForm</Edit>
-  <New>DocumentLibraryForm</New>
-</FormTemplates>
+<file path=customXml/itemProps2.xml><?xml version="1.0" encoding="utf-8"?>
+<ds:datastoreItem xmlns:ds="http://schemas.openxmlformats.org/officeDocument/2006/customXml" ds:itemID="{571257EF-E674-4FED-B0BE-93EA3128E9EE}">
+  <ds:schemaRefs>
+    <ds:schemaRef ds:uri="http://schemas.microsoft.com/office/2006/metadata/properties"/>
+    <ds:schemaRef ds:uri="http://schemas.microsoft.com/office/infopath/2007/PartnerControls"/>
+    <ds:schemaRef ds:uri="b34db95d-295c-47a3-aa90-4a99ea15312e"/>
+    <ds:schemaRef ds:uri="d9bf6276-5224-4538-aa70-e59fb8bd1d46"/>
+  </ds:schemaRefs>
+</ds:datastoreItem>
 </file>
 
-<file path=customXml/itemProps1.xml><?xml version="1.0" encoding="utf-8"?>
+<file path=customXml/itemProps3.xml><?xml version="1.0" encoding="utf-8"?>
 <ds:datastoreItem xmlns:ds="http://schemas.openxmlformats.org/officeDocument/2006/customXml" ds:itemID="{AA85851A-28D1-4936-B311-42F1D38B570E}">
   <ds:schemaRefs>
     <ds:schemaRef ds:uri="http://schemas.microsoft.com/office/2006/metadata/contentType"/>
@@ -3945,23 +3976,4 @@
     <ds:schemaRef ds:uri="http://schemas.microsoft.com/internal/obd"/>
   </ds:schemaRefs>
 </ds:datastoreItem>
-</file>
-
-<file path=customXml/itemProps2.xml><?xml version="1.0" encoding="utf-8"?>
-<ds:datastoreItem xmlns:ds="http://schemas.openxmlformats.org/officeDocument/2006/customXml" ds:itemID="{571257EF-E674-4FED-B0BE-93EA3128E9EE}">
-  <ds:schemaRefs>
-    <ds:schemaRef ds:uri="http://schemas.microsoft.com/office/2006/metadata/properties"/>
-    <ds:schemaRef ds:uri="http://schemas.microsoft.com/office/infopath/2007/PartnerControls"/>
-    <ds:schemaRef ds:uri="b34db95d-295c-47a3-aa90-4a99ea15312e"/>
-    <ds:schemaRef ds:uri="d9bf6276-5224-4538-aa70-e59fb8bd1d46"/>
-  </ds:schemaRefs>
-</ds:datastoreItem>
-</file>
-
-<file path=customXml/itemProps3.xml><?xml version="1.0" encoding="utf-8"?>
-<ds:datastoreItem xmlns:ds="http://schemas.openxmlformats.org/officeDocument/2006/customXml" ds:itemID="{0E8014CC-8330-4B76-BB01-5261046B1A55}">
-  <ds:schemaRefs>
-    <ds:schemaRef ds:uri="http://schemas.microsoft.com/sharepoint/v3/contenttype/forms"/>
-  </ds:schemaRefs>
-</ds:datastoreItem>
 </file>
</xml_diff>